<commit_message>
Utilize for better cv writing results
</commit_message>
<xml_diff>
--- a/talasli_cv_eng.docx
+++ b/talasli_cv_eng.docx
@@ -2,20 +2,6 @@
 <file path=word/document.xml><?xml version="1.0" encoding="utf-8"?>
 <w:document xmlns:wpc="http://schemas.microsoft.com/office/word/2010/wordprocessingCanvas" xmlns:cx="http://schemas.microsoft.com/office/drawing/2014/chartex" xmlns:cx1="http://schemas.microsoft.com/office/drawing/2015/9/8/chartex" xmlns:cx2="http://schemas.microsoft.com/office/drawing/2015/10/21/chartex" xmlns:cx3="http://schemas.microsoft.com/office/drawing/2016/5/9/chartex" xmlns:cx4="http://schemas.microsoft.com/office/drawing/2016/5/10/chartex" xmlns:cx5="http://schemas.microsoft.com/office/drawing/2016/5/11/chartex" xmlns:cx6="http://schemas.microsoft.com/office/drawing/2016/5/12/chartex" xmlns:cx7="http://schemas.microsoft.com/office/drawing/2016/5/13/chartex" xmlns:cx8="http://schemas.microsoft.com/office/drawing/2016/5/14/chartex" xmlns:mc="http://schemas.openxmlformats.org/markup-compatibility/2006" xmlns:aink="http://schemas.microsoft.com/office/drawing/2016/ink" xmlns:am3d="http://schemas.microsoft.com/office/drawing/2017/model3d" xmlns:o="urn:schemas-microsoft-com:office:office" xmlns:r="http://schemas.openxmlformats.org/officeDocument/2006/relationships" xmlns:m="http://schemas.openxmlformats.org/officeDocument/2006/math" xmlns:v="urn:schemas-microsoft-com:vml" xmlns:wp14="http://schemas.microsoft.com/office/word/2010/wordprocessingDrawing" xmlns:wp="http://schemas.openxmlformats.org/drawingml/2006/wordprocessingDrawing" xmlns:w10="urn:schemas-microsoft-com:office:word" xmlns:w="http://schemas.openxmlformats.org/wordprocessingml/2006/main" xmlns:w14="http://schemas.microsoft.com/office/word/2010/wordml" xmlns:w15="http://schemas.microsoft.com/office/word/2012/wordml" xmlns:w16cid="http://schemas.microsoft.com/office/word/2016/wordml/cid" xmlns:w16se="http://schemas.microsoft.com/office/word/2015/wordml/symex" xmlns:wpg="http://schemas.microsoft.com/office/word/2010/wordprocessingGroup" xmlns:wpi="http://schemas.microsoft.com/office/word/2010/wordprocessingInk" xmlns:wne="http://schemas.microsoft.com/office/word/2006/wordml" xmlns:wps="http://schemas.microsoft.com/office/word/2010/wordprocessingShape" mc:Ignorable="w14 w15 w16se w16cid wp14">
   <w:body>
-    <w:p>
-      <w:pPr>
-        <w:widowControl w:val="0"/>
-        <w:pBdr>
-          <w:top w:val="nil"/>
-          <w:left w:val="nil"/>
-          <w:bottom w:val="nil"/>
-          <w:right w:val="nil"/>
-          <w:between w:val="nil"/>
-        </w:pBdr>
-        <w:spacing w:after="0" w:line="276" w:lineRule="auto"/>
-        <w:jc w:val="left"/>
-      </w:pPr>
-    </w:p>
     <w:p>
       <w:pPr>
         <w:pBdr>
@@ -124,7 +110,7 @@
         </w:rPr>
         <w:t xml:space="preserve"> </w:t>
       </w:r>
-      <w:hyperlink r:id="rId8">
+      <w:hyperlink r:id="rId9">
         <w:r>
           <w:rPr>
             <w:color w:val="000000"/>
@@ -172,55 +158,24 @@
     </w:p>
     <w:p>
       <w:pPr>
-        <w:pBdr>
-          <w:top w:val="nil"/>
-          <w:left w:val="nil"/>
-          <w:bottom w:val="nil"/>
-          <w:right w:val="nil"/>
-          <w:between w:val="nil"/>
-        </w:pBdr>
-        <w:spacing w:after="200"/>
-        <w:rPr>
-          <w:color w:val="000000"/>
-        </w:rPr>
-      </w:pPr>
-      <w:r>
-        <w:rPr>
-          <w:color w:val="000000"/>
-        </w:rPr>
-        <w:t xml:space="preserve">With a Bachelor's degree in Petroleum and Natural Gas Engineering, acquired 7 years of experience in the energy sector, primarily focusing on production, well completion, and offshore operations. Currently completing a Master's degree in Computer Engineering, aiming to </w:t>
-      </w:r>
-      <w:r>
-        <w:rPr>
-          <w:color w:val="000000"/>
-        </w:rPr>
-        <w:t xml:space="preserve">continue his </w:t>
-      </w:r>
-      <w:r>
-        <w:rPr>
-          <w:color w:val="000000"/>
-        </w:rPr>
-        <w:t>career</w:t>
-      </w:r>
-      <w:r>
-        <w:rPr>
-          <w:color w:val="000000"/>
-        </w:rPr>
-        <w:t xml:space="preserve"> </w:t>
-      </w:r>
-      <w:r>
-        <w:rPr>
-          <w:color w:val="000000"/>
-        </w:rPr>
-        <w:t>as a Software Eng</w:t>
-      </w:r>
-      <w:bookmarkStart w:id="0" w:name="_GoBack"/>
-      <w:bookmarkEnd w:id="0"/>
-      <w:r>
-        <w:rPr>
-          <w:color w:val="000000"/>
-        </w:rPr>
-        <w:t>ineer.</w:t>
+        <w:spacing w:after="210"/>
+      </w:pPr>
+      <w:r>
+        <w:t xml:space="preserve">Results-driven professional translating 7 years of rigorous engineering problem-solving into Full-Stack Software Development. Currently completing an MSc in Computer Engineering with hands-on expertise in .NET, React, and scalable cloud architectures. Highly adaptable and motivated to utilize AI coding tools to optimize development workflows and build 'feel-good' user interfaces. Excited to contribute agile, AI-driven development solutions to ARD </w:t>
+      </w:r>
+      <w:proofErr w:type="spellStart"/>
+      <w:r>
+        <w:t>Bili</w:t>
+      </w:r>
+      <w:r>
+        <w:t>s</w:t>
+      </w:r>
+      <w:r>
+        <w:t>im's</w:t>
+      </w:r>
+      <w:proofErr w:type="spellEnd"/>
+      <w:r>
+        <w:t xml:space="preserve"> innovative projects across the logistics, health, and finance sectors.</w:t>
       </w:r>
     </w:p>
     <w:p>
@@ -294,6 +249,7 @@
           <w:tab w:val="right" w:pos="10710"/>
         </w:tabs>
         <w:spacing w:after="0"/>
+        <w:ind w:left="288" w:hanging="288"/>
         <w:rPr>
           <w:b/>
           <w:bCs/>
@@ -325,6 +281,31 @@
           <w:color w:val="000000"/>
         </w:rPr>
         <w:t>2026</w:t>
+      </w:r>
+    </w:p>
+    <w:p>
+      <w:pPr>
+        <w:pBdr>
+          <w:top w:val="nil"/>
+          <w:left w:val="nil"/>
+          <w:bottom w:val="nil"/>
+          <w:right w:val="nil"/>
+          <w:between w:val="nil"/>
+        </w:pBdr>
+        <w:tabs>
+          <w:tab w:val="right" w:pos="10710"/>
+        </w:tabs>
+        <w:spacing w:after="120"/>
+        <w:ind w:left="300" w:hanging="300"/>
+        <w:rPr>
+          <w:color w:val="000000"/>
+        </w:rPr>
+      </w:pPr>
+      <w:r>
+        <w:rPr>
+          <w:color w:val="000000"/>
+        </w:rPr>
+        <w:t>Elective Courses: Data Engineering, Advanced Cyber Security and Cryptology</w:t>
       </w:r>
     </w:p>
     <w:p>
@@ -346,9 +327,79 @@
       </w:pPr>
       <w:r>
         <w:rPr>
-          <w:color w:val="000000"/>
-        </w:rPr>
-        <w:t>Elective Courses: Data Engineering, Advanced Cyber Security and Cryptology</w:t>
+          <w:b/>
+          <w:bCs/>
+          <w:color w:val="000000"/>
+        </w:rPr>
+        <w:t>Middle East Technical University</w:t>
+      </w:r>
+      <w:r>
+        <w:rPr>
+          <w:color w:val="000000"/>
+        </w:rPr>
+        <w:tab/>
+        <w:t xml:space="preserve"> Ankara</w:t>
+      </w:r>
+    </w:p>
+    <w:p>
+      <w:pPr>
+        <w:pBdr>
+          <w:top w:val="nil"/>
+          <w:left w:val="nil"/>
+          <w:bottom w:val="nil"/>
+          <w:right w:val="nil"/>
+          <w:between w:val="nil"/>
+        </w:pBdr>
+        <w:tabs>
+          <w:tab w:val="right" w:pos="10710"/>
+        </w:tabs>
+        <w:spacing w:after="210"/>
+        <w:ind w:left="300" w:hanging="300"/>
+        <w:rPr>
+          <w:b/>
+          <w:bCs/>
+          <w:color w:val="000000"/>
+        </w:rPr>
+      </w:pPr>
+      <w:r>
+        <w:rPr>
+          <w:color w:val="000000"/>
+        </w:rPr>
+        <w:t>Bachelor of Science in Petroleum and Natural Gas Engineering</w:t>
+      </w:r>
+      <w:r>
+        <w:rPr>
+          <w:b/>
+          <w:bCs/>
+          <w:color w:val="000000"/>
+        </w:rPr>
+        <w:tab/>
+        <w:t>2019</w:t>
+      </w:r>
+    </w:p>
+    <w:p>
+      <w:pPr>
+        <w:pBdr>
+          <w:top w:val="none" w:sz="0" w:space="0" w:color="000000"/>
+          <w:left w:val="nil"/>
+          <w:bottom w:val="single" w:sz="4" w:space="1" w:color="000000"/>
+          <w:right w:val="nil"/>
+          <w:between w:val="nil"/>
+        </w:pBdr>
+        <w:spacing w:after="80"/>
+        <w:rPr>
+          <w:color w:val="222A35"/>
+          <w:sz w:val="26"/>
+          <w:szCs w:val="26"/>
+        </w:rPr>
+      </w:pPr>
+      <w:r>
+        <w:rPr>
+          <w:color w:val="222A35"/>
+          <w:sz w:val="26"/>
+          <w:szCs w:val="26"/>
+        </w:rPr>
+        <w:t>EXPERIENCE</w:t>
       </w:r>
     </w:p>
     <w:p>
@@ -365,9 +416,106 @@
         </w:tabs>
         <w:spacing w:after="0"/>
         <w:rPr>
-          <w:color w:val="000000"/>
-        </w:rPr>
-      </w:pPr>
+          <w:b/>
+          <w:bCs/>
+          <w:color w:val="000000"/>
+        </w:rPr>
+      </w:pPr>
+      <w:r>
+        <w:rPr>
+          <w:b/>
+          <w:bCs/>
+          <w:color w:val="000000"/>
+        </w:rPr>
+        <w:t>Ma</w:t>
+      </w:r>
+      <w:r>
+        <w:rPr>
+          <w:b/>
+          <w:bCs/>
+        </w:rPr>
+        <w:t>terials Coordinator</w:t>
+      </w:r>
+      <w:r>
+        <w:rPr>
+          <w:b/>
+          <w:bCs/>
+          <w:color w:val="000000"/>
+        </w:rPr>
+        <w:tab/>
+        <w:t xml:space="preserve">2020 – </w:t>
+      </w:r>
+      <w:r>
+        <w:rPr>
+          <w:b/>
+          <w:bCs/>
+          <w:color w:val="000000"/>
+        </w:rPr>
+        <w:t>Present</w:t>
+      </w:r>
+    </w:p>
+    <w:p>
+      <w:pPr>
+        <w:pBdr>
+          <w:top w:val="nil"/>
+          <w:left w:val="nil"/>
+          <w:bottom w:val="nil"/>
+          <w:right w:val="nil"/>
+          <w:between w:val="nil"/>
+        </w:pBdr>
+        <w:tabs>
+          <w:tab w:val="right" w:pos="10710"/>
+        </w:tabs>
+        <w:spacing w:after="80"/>
+        <w:rPr>
+          <w:color w:val="000000"/>
+        </w:rPr>
+      </w:pPr>
+      <w:r>
+        <w:rPr>
+          <w:color w:val="000000"/>
+        </w:rPr>
+        <w:t>Global Offshore Engineering</w:t>
+      </w:r>
+      <w:r>
+        <w:rPr>
+          <w:color w:val="000000"/>
+        </w:rPr>
+        <w:tab/>
+        <w:t>DS Fatih</w:t>
+      </w:r>
+    </w:p>
+    <w:p>
+      <w:pPr>
+        <w:pBdr>
+          <w:top w:val="nil"/>
+          <w:left w:val="nil"/>
+          <w:bottom w:val="nil"/>
+          <w:right w:val="nil"/>
+          <w:between w:val="nil"/>
+        </w:pBdr>
+        <w:spacing w:after="120"/>
+      </w:pPr>
+      <w:r>
+        <w:rPr>
+          <w:highlight w:val="white"/>
+        </w:rPr>
+        <w:t>Acted as the central contact for procurement and inventory management, optimizing warehouse workflows, critical</w:t>
+      </w:r>
+      <w:r>
+        <w:rPr>
+          <w:highlight w:val="white"/>
+        </w:rPr>
+        <w:t xml:space="preserve"> </w:t>
+      </w:r>
+      <w:r>
+        <w:rPr>
+          <w:highlight w:val="white"/>
+        </w:rPr>
+        <w:t>stock levels, and overall operational efficiency.</w:t>
+      </w:r>
+      <w:bookmarkStart w:id="0" w:name="_GoBack"/>
+      <w:bookmarkEnd w:id="0"/>
     </w:p>
     <w:p>
       <w:pPr>
@@ -383,49 +531,17 @@
         </w:tabs>
         <w:spacing w:after="0"/>
         <w:rPr>
-          <w:color w:val="000000"/>
-        </w:rPr>
-      </w:pPr>
-      <w:r>
-        <w:rPr>
           <w:b/>
           <w:bCs/>
           <w:color w:val="000000"/>
         </w:rPr>
-        <w:t>Middle East Technical University</w:t>
-      </w:r>
-      <w:r>
-        <w:rPr>
-          <w:color w:val="000000"/>
-        </w:rPr>
-        <w:tab/>
-        <w:t xml:space="preserve"> Ankara</w:t>
-      </w:r>
-    </w:p>
-    <w:p>
-      <w:pPr>
-        <w:pBdr>
-          <w:top w:val="nil"/>
-          <w:left w:val="nil"/>
-          <w:bottom w:val="nil"/>
-          <w:right w:val="nil"/>
-          <w:between w:val="nil"/>
-        </w:pBdr>
-        <w:tabs>
-          <w:tab w:val="right" w:pos="10710"/>
-        </w:tabs>
-        <w:spacing w:after="0"/>
+      </w:pPr>
+      <w:r>
         <w:rPr>
           <w:b/>
           <w:bCs/>
-          <w:color w:val="000000"/>
-        </w:rPr>
-      </w:pPr>
-      <w:r>
-        <w:rPr>
-          <w:color w:val="000000"/>
-        </w:rPr>
-        <w:t>Bachelor of Science in Petroleum and Natural Gas Engineering</w:t>
+        </w:rPr>
+        <w:t>Production Engineer</w:t>
       </w:r>
       <w:r>
         <w:rPr>
@@ -434,102 +550,7 @@
           <w:color w:val="000000"/>
         </w:rPr>
         <w:tab/>
-        <w:t>2019</w:t>
-      </w:r>
-    </w:p>
-    <w:p>
-      <w:pPr>
-        <w:pBdr>
-          <w:top w:val="nil"/>
-          <w:left w:val="nil"/>
-          <w:bottom w:val="nil"/>
-          <w:right w:val="nil"/>
-          <w:between w:val="nil"/>
-        </w:pBdr>
-        <w:tabs>
-          <w:tab w:val="right" w:pos="10710"/>
-        </w:tabs>
-        <w:spacing w:after="0"/>
-        <w:rPr>
-          <w:color w:val="000000"/>
-        </w:rPr>
-      </w:pPr>
-    </w:p>
-    <w:p>
-      <w:pPr>
-        <w:pBdr>
-          <w:top w:val="none" w:sz="0" w:space="0" w:color="000000"/>
-          <w:left w:val="nil"/>
-          <w:bottom w:val="single" w:sz="4" w:space="1" w:color="000000"/>
-          <w:right w:val="nil"/>
-          <w:between w:val="nil"/>
-        </w:pBdr>
-        <w:spacing w:after="80"/>
-        <w:rPr>
-          <w:color w:val="222A35"/>
-          <w:sz w:val="26"/>
-          <w:szCs w:val="26"/>
-        </w:rPr>
-      </w:pPr>
-      <w:r>
-        <w:rPr>
-          <w:color w:val="222A35"/>
-          <w:sz w:val="26"/>
-          <w:szCs w:val="26"/>
-        </w:rPr>
-        <w:t>EXPERIENCE</w:t>
-      </w:r>
-    </w:p>
-    <w:p>
-      <w:pPr>
-        <w:pBdr>
-          <w:top w:val="nil"/>
-          <w:left w:val="nil"/>
-          <w:bottom w:val="nil"/>
-          <w:right w:val="nil"/>
-          <w:between w:val="nil"/>
-        </w:pBdr>
-        <w:tabs>
-          <w:tab w:val="right" w:pos="10710"/>
-        </w:tabs>
-        <w:spacing w:after="0"/>
-        <w:rPr>
-          <w:b/>
-          <w:bCs/>
-          <w:color w:val="000000"/>
-        </w:rPr>
-      </w:pPr>
-      <w:r>
-        <w:rPr>
-          <w:b/>
-          <w:bCs/>
-          <w:color w:val="000000"/>
-        </w:rPr>
-        <w:t>Ma</w:t>
-      </w:r>
-      <w:r>
-        <w:rPr>
-          <w:b/>
-          <w:bCs/>
-        </w:rPr>
-        <w:t>terials Coordinator</w:t>
-      </w:r>
-      <w:r>
-        <w:rPr>
-          <w:b/>
-          <w:bCs/>
-          <w:color w:val="000000"/>
-        </w:rPr>
-        <w:tab/>
-        <w:t xml:space="preserve">2020 – </w:t>
-      </w:r>
-      <w:r>
-        <w:rPr>
-          <w:b/>
-          <w:bCs/>
-          <w:color w:val="000000"/>
-        </w:rPr>
-        <w:t>Present</w:t>
+        <w:t>2019 – 2020</w:t>
       </w:r>
     </w:p>
     <w:p>
@@ -549,26 +570,62 @@
           <w:color w:val="000000"/>
         </w:rPr>
       </w:pPr>
-      <w:r>
-        <w:rPr>
-          <w:color w:val="000000"/>
-        </w:rPr>
-        <w:t>Global Offshore Engineering</w:t>
+      <w:proofErr w:type="spellStart"/>
+      <w:r>
+        <w:rPr>
+          <w:color w:val="000000"/>
+        </w:rPr>
+        <w:t>Arar</w:t>
+      </w:r>
+      <w:proofErr w:type="spellEnd"/>
+      <w:r>
+        <w:rPr>
+          <w:color w:val="000000"/>
+        </w:rPr>
+        <w:t xml:space="preserve"> Petrol A.</w:t>
+      </w:r>
+      <w:r>
+        <w:t>S</w:t>
+      </w:r>
+      <w:r>
+        <w:rPr>
+          <w:color w:val="000000"/>
+        </w:rPr>
+        <w:t>.</w:t>
       </w:r>
       <w:r>
         <w:rPr>
           <w:color w:val="000000"/>
         </w:rPr>
         <w:tab/>
-        <w:t>DS Fatih</w:t>
+      </w:r>
+      <w:r>
+        <w:rPr>
+          <w:color w:val="000000"/>
+        </w:rPr>
+        <w:t>S</w:t>
+      </w:r>
+      <w:r>
+        <w:rPr>
+          <w:color w:val="000000"/>
+        </w:rPr>
+        <w:t>anl</w:t>
+      </w:r>
+      <w:r>
+        <w:rPr>
+          <w:color w:val="000000"/>
+        </w:rPr>
+        <w:t>i</w:t>
+      </w:r>
+      <w:r>
+        <w:rPr>
+          <w:color w:val="000000"/>
+        </w:rPr>
+        <w:t>urfa</w:t>
       </w:r>
     </w:p>
     <w:p>
       <w:pPr>
-        <w:numPr>
-          <w:ilvl w:val="0"/>
-          <w:numId w:val="1"/>
-        </w:numPr>
         <w:pBdr>
           <w:top w:val="nil"/>
           <w:left w:val="nil"/>
@@ -576,136 +633,7 @@
           <w:right w:val="nil"/>
           <w:between w:val="nil"/>
         </w:pBdr>
-        <w:spacing w:after="0"/>
-      </w:pPr>
-      <w:r>
-        <w:rPr>
-          <w:highlight w:val="white"/>
-        </w:rPr>
-        <w:t>Acted as the central contact for procurement and inventory management, optimizing warehouse workflows, critical stock levels, and overall operational efficiency.</w:t>
-      </w:r>
-    </w:p>
-    <w:p>
-      <w:pPr>
-        <w:pBdr>
-          <w:top w:val="nil"/>
-          <w:left w:val="nil"/>
-          <w:bottom w:val="nil"/>
-          <w:right w:val="nil"/>
-          <w:between w:val="nil"/>
-        </w:pBdr>
-        <w:tabs>
-          <w:tab w:val="right" w:pos="10710"/>
-        </w:tabs>
-        <w:spacing w:after="0"/>
-        <w:rPr>
-          <w:b/>
-          <w:bCs/>
-          <w:color w:val="000000"/>
-        </w:rPr>
-      </w:pPr>
-      <w:r>
-        <w:rPr>
-          <w:b/>
-          <w:bCs/>
-        </w:rPr>
-        <w:t>Production Engineer</w:t>
-      </w:r>
-      <w:r>
-        <w:rPr>
-          <w:b/>
-          <w:bCs/>
-          <w:color w:val="000000"/>
-        </w:rPr>
-        <w:tab/>
-        <w:t>2019 – 2020</w:t>
-      </w:r>
-    </w:p>
-    <w:p>
-      <w:pPr>
-        <w:pBdr>
-          <w:top w:val="nil"/>
-          <w:left w:val="nil"/>
-          <w:bottom w:val="nil"/>
-          <w:right w:val="nil"/>
-          <w:between w:val="nil"/>
-        </w:pBdr>
-        <w:tabs>
-          <w:tab w:val="right" w:pos="10710"/>
-        </w:tabs>
-        <w:spacing w:after="80"/>
-        <w:rPr>
-          <w:color w:val="000000"/>
-        </w:rPr>
-      </w:pPr>
-      <w:proofErr w:type="spellStart"/>
-      <w:r>
-        <w:rPr>
-          <w:color w:val="000000"/>
-        </w:rPr>
-        <w:t>Arar</w:t>
-      </w:r>
-      <w:proofErr w:type="spellEnd"/>
-      <w:r>
-        <w:rPr>
-          <w:color w:val="000000"/>
-        </w:rPr>
-        <w:t xml:space="preserve"> Petrol A.</w:t>
-      </w:r>
-      <w:r>
-        <w:t>S</w:t>
-      </w:r>
-      <w:r>
-        <w:rPr>
-          <w:color w:val="000000"/>
-        </w:rPr>
-        <w:t>.</w:t>
-      </w:r>
-      <w:r>
-        <w:rPr>
-          <w:color w:val="000000"/>
-        </w:rPr>
-        <w:tab/>
-      </w:r>
-      <w:r>
-        <w:rPr>
-          <w:color w:val="000000"/>
-        </w:rPr>
-        <w:t>S</w:t>
-      </w:r>
-      <w:r>
-        <w:rPr>
-          <w:color w:val="000000"/>
-        </w:rPr>
-        <w:t>anl</w:t>
-      </w:r>
-      <w:r>
-        <w:rPr>
-          <w:color w:val="000000"/>
-        </w:rPr>
-        <w:t>i</w:t>
-      </w:r>
-      <w:r>
-        <w:rPr>
-          <w:color w:val="000000"/>
-        </w:rPr>
-        <w:t>urfa</w:t>
-      </w:r>
-    </w:p>
-    <w:p>
-      <w:pPr>
-        <w:numPr>
-          <w:ilvl w:val="0"/>
-          <w:numId w:val="1"/>
-        </w:numPr>
-        <w:pBdr>
-          <w:top w:val="nil"/>
-          <w:left w:val="nil"/>
-          <w:bottom w:val="nil"/>
-          <w:right w:val="nil"/>
-          <w:between w:val="nil"/>
-        </w:pBdr>
-        <w:spacing w:after="0"/>
+        <w:spacing w:after="210"/>
       </w:pPr>
       <w:r>
         <w:rPr>
@@ -763,127 +691,56 @@
     </w:p>
     <w:p>
       <w:pPr>
-        <w:numPr>
-          <w:ilvl w:val="0"/>
-          <w:numId w:val="1"/>
-        </w:numPr>
-        <w:pBdr>
-          <w:top w:val="nil"/>
-          <w:left w:val="nil"/>
-          <w:bottom w:val="nil"/>
-          <w:right w:val="nil"/>
-          <w:between w:val="nil"/>
-        </w:pBdr>
-        <w:spacing w:after="0"/>
-      </w:pPr>
-      <w:bookmarkStart w:id="1" w:name="_heading=h.704u2pz8guvb" w:colFirst="0" w:colLast="0"/>
-      <w:bookmarkEnd w:id="1"/>
-      <w:proofErr w:type="spellStart"/>
-      <w:r>
-        <w:t>gRPC</w:t>
-      </w:r>
-      <w:proofErr w:type="spellEnd"/>
-      <w:r>
-        <w:t xml:space="preserve"> and JWT Performance Optimization in Microservice Architectures (Master's Thesis)</w:t>
-      </w:r>
-      <w:r>
-        <w:rPr>
-          <w:color w:val="000000"/>
-        </w:rPr>
-        <w:t xml:space="preserve">  </w:t>
+        <w:spacing w:after="120"/>
+      </w:pPr>
+      <w:r>
+        <w:t>Designed and implemented</w:t>
+      </w:r>
+      <w:r>
+        <w:t xml:space="preserve"> </w:t>
+      </w:r>
+      <w:r>
+        <w:t>(Master's Thesis)</w:t>
+      </w:r>
+      <w:r>
+        <w:t xml:space="preserve"> a 'JWT Decoupling Strategy' within a polyglot Google Cloud Microservices environment to optimize high-traffic network bottlenecks. Achieved a 15% reduction in network traffic and significantly improved system performance, reducing </w:t>
+      </w:r>
+      <w:r>
+        <w:t>average gRPC latency by 50% and P99 tail latency by 25% through meticulous A/B testing and gRPC Interceptor integration.</w:t>
       </w:r>
     </w:p>
     <w:p>
       <w:pPr>
-        <w:pBdr>
-          <w:top w:val="nil"/>
-          <w:left w:val="nil"/>
-          <w:bottom w:val="nil"/>
-          <w:right w:val="nil"/>
-          <w:between w:val="nil"/>
-        </w:pBdr>
-        <w:spacing w:after="0"/>
-        <w:rPr>
-          <w:color w:val="000000"/>
-        </w:rPr>
-      </w:pPr>
-      <w:r>
-        <w:rPr>
-          <w:color w:val="000000"/>
-        </w:rPr>
-        <w:t xml:space="preserve">To resolve high-traffic network bottlenecks in cloud-based microservice communication, I designed an original "JWT Decoupling Strategy" and integrated it into the system using </w:t>
-      </w:r>
-      <w:proofErr w:type="spellStart"/>
-      <w:r>
-        <w:rPr>
-          <w:color w:val="000000"/>
-        </w:rPr>
-        <w:t>gRPC</w:t>
-      </w:r>
-      <w:proofErr w:type="spellEnd"/>
-      <w:r>
-        <w:rPr>
-          <w:color w:val="000000"/>
-        </w:rPr>
-        <w:t xml:space="preserve"> Interceptors. Following comprehensive A/B testing in a polyglot Google Cloud Microservices test environment, I reduced overall network traffic by 15%. Dramatically increased system performance under high-load conditions, improving average </w:t>
-      </w:r>
-      <w:proofErr w:type="spellStart"/>
-      <w:r>
-        <w:rPr>
-          <w:color w:val="000000"/>
-        </w:rPr>
-        <w:t>gRPC</w:t>
-      </w:r>
-      <w:proofErr w:type="spellEnd"/>
-      <w:r>
-        <w:rPr>
-          <w:color w:val="000000"/>
-        </w:rPr>
-        <w:t xml:space="preserve"> latency by 50% and P99 tail latency by 25%.</w:t>
+        <w:spacing w:after="120"/>
+      </w:pPr>
+      <w:r>
+        <w:t>Developed and deployed a full-stack web application to AWS, implementing robust authentication, secure network traffic, and comprehensi</w:t>
+      </w:r>
+      <w:r>
+        <w:t>ve metric monitoring. This project showcased end-to-end development, API-first principles, and foundational DevOps practices for rapid iteration and deployment.</w:t>
       </w:r>
     </w:p>
     <w:p>
       <w:pPr>
-        <w:numPr>
-          <w:ilvl w:val="0"/>
-          <w:numId w:val="1"/>
-        </w:numPr>
-        <w:pBdr>
-          <w:top w:val="nil"/>
-          <w:left w:val="nil"/>
-          <w:bottom w:val="nil"/>
-          <w:right w:val="nil"/>
-          <w:between w:val="nil"/>
-        </w:pBdr>
-        <w:spacing w:after="200"/>
-      </w:pPr>
-      <w:r>
-        <w:t>Developed and deployed a full-stack web application with an authentication infrastructure to an AWS environment. Secured the application's network traffic and successfully integrated metric monitoring processes.</w:t>
+        <w:spacing w:after="120"/>
+      </w:pPr>
+      <w:r>
+        <w:t>Engineered a scalable, end-to-end data pipeline utilizing Kafka, Spark, and Elasticsearch for r</w:t>
+      </w:r>
+      <w:r>
+        <w:t>eal-time processing and big data storage of e-commerce analytics. Containerized the entire system with Docker, demonstrating robust automation capabilities and efficient data management.</w:t>
       </w:r>
     </w:p>
     <w:p>
       <w:pPr>
-        <w:numPr>
-          <w:ilvl w:val="0"/>
-          <w:numId w:val="1"/>
-        </w:numPr>
-        <w:pBdr>
-          <w:top w:val="nil"/>
-          <w:left w:val="nil"/>
-          <w:bottom w:val="nil"/>
-          <w:right w:val="nil"/>
-          <w:between w:val="nil"/>
-        </w:pBdr>
-        <w:spacing w:after="200"/>
-      </w:pPr>
-      <w:hyperlink r:id="rId9">
-        <w:r>
-          <w:rPr>
-            <w:color w:val="000000"/>
-          </w:rPr>
-          <w:t>Designed an end-to-end scalable data pipeline using Kafka, Spark, and Elasticsearch to enable both real-time processing and big data storage of e-commerce data, containerizing the entire system on Docker.</w:t>
-        </w:r>
-      </w:hyperlink>
+        <w:spacing w:after="210"/>
+      </w:pPr>
+      <w:r>
+        <w:t>Developed a responsive, user-centric web interface using React.js and</w:t>
+      </w:r>
+      <w:r>
+        <w:t xml:space="preserve"> ASP.NET Core, focusing on intuitive UI/UX design and rapid feature iteration. Successfully implemented an API-first approach, enabling seamless integration and efficient data exchange for a dynamic user experience.</w:t>
+      </w:r>
     </w:p>
     <w:p>
       <w:pPr>
@@ -919,177 +776,68 @@
       </w:r>
     </w:p>
     <w:p>
-      <w:pPr>
-        <w:pBdr>
-          <w:top w:val="nil"/>
-          <w:left w:val="nil"/>
-          <w:bottom w:val="nil"/>
-          <w:right w:val="nil"/>
-          <w:between w:val="nil"/>
-        </w:pBdr>
-        <w:tabs>
-          <w:tab w:val="left" w:pos="5400"/>
-        </w:tabs>
-        <w:spacing w:after="0"/>
-        <w:rPr>
-          <w:color w:val="000000"/>
-        </w:rPr>
-      </w:pPr>
       <w:r>
         <w:rPr>
           <w:b/>
-          <w:bCs/>
-          <w:color w:val="000000"/>
-        </w:rPr>
-        <w:t>Programming Languages:</w:t>
-      </w:r>
-      <w:r>
-        <w:rPr>
-          <w:b/>
-          <w:bCs/>
-          <w:color w:val="000000"/>
-        </w:rPr>
-        <w:t xml:space="preserve"> </w:t>
-      </w:r>
-      <w:r>
-        <w:rPr>
-          <w:color w:val="000000"/>
-        </w:rPr>
-        <w:t xml:space="preserve">C#, JavaScript, </w:t>
-      </w:r>
-      <w:r>
-        <w:rPr>
-          <w:color w:val="000000"/>
-          <w:highlight w:val="white"/>
-        </w:rPr>
-        <w:t>Python</w:t>
-      </w:r>
-      <w:r>
-        <w:rPr>
-          <w:color w:val="000000"/>
-        </w:rPr>
-        <w:t>, HTML5/CSS3</w:t>
+        </w:rPr>
+        <w:t xml:space="preserve">Programming Languages: </w:t>
+      </w:r>
+      <w:r>
+        <w:t>C#, JavaScript, Python, HTML5/CSS3</w:t>
       </w:r>
     </w:p>
     <w:p>
-      <w:pPr>
-        <w:pBdr>
-          <w:top w:val="nil"/>
-          <w:left w:val="nil"/>
-          <w:bottom w:val="nil"/>
-          <w:right w:val="nil"/>
-          <w:between w:val="nil"/>
-        </w:pBdr>
-        <w:tabs>
-          <w:tab w:val="left" w:pos="5400"/>
-        </w:tabs>
-        <w:spacing w:after="0"/>
-        <w:rPr>
-          <w:color w:val="000000"/>
-        </w:rPr>
-      </w:pPr>
       <w:r>
         <w:rPr>
           <w:b/>
-          <w:bCs/>
-          <w:color w:val="000000"/>
-        </w:rPr>
-        <w:t>Frameworks &amp; Libraries:</w:t>
-      </w:r>
-      <w:r>
-        <w:rPr>
-          <w:b/>
-          <w:bCs/>
-          <w:color w:val="000000"/>
-        </w:rPr>
-        <w:t xml:space="preserve"> </w:t>
-      </w:r>
-      <w:r>
-        <w:rPr>
-          <w:color w:val="000000"/>
-        </w:rPr>
-        <w:t>.NET (ASP.NET Core), React.js, Entity Framework (EF) Core, Node.js, RESTful APIs</w:t>
+        </w:rPr>
+        <w:t xml:space="preserve">Frameworks &amp; Libraries: </w:t>
+      </w:r>
+      <w:r>
+        <w:t>.NET (ASP.NET Core, EF Core), React.js, Node.js, RESTful APIs</w:t>
       </w:r>
     </w:p>
     <w:p>
-      <w:pPr>
-        <w:pBdr>
-          <w:top w:val="nil"/>
-          <w:left w:val="nil"/>
-          <w:bottom w:val="nil"/>
-          <w:right w:val="nil"/>
-          <w:between w:val="nil"/>
-        </w:pBdr>
-        <w:tabs>
-          <w:tab w:val="left" w:pos="5400"/>
-        </w:tabs>
-        <w:spacing w:after="0"/>
-        <w:rPr>
-          <w:color w:val="000000"/>
-        </w:rPr>
-      </w:pPr>
-      <w:bookmarkStart w:id="2" w:name="_heading=h.lkr9mw3v2it3" w:colFirst="0" w:colLast="0"/>
-      <w:bookmarkEnd w:id="2"/>
       <w:r>
         <w:rPr>
           <w:b/>
-          <w:bCs/>
-          <w:color w:val="000000"/>
-        </w:rPr>
-        <w:t>Database Systems:</w:t>
-      </w:r>
-      <w:r>
-        <w:rPr>
-          <w:b/>
-          <w:bCs/>
-          <w:color w:val="000000"/>
-        </w:rPr>
-        <w:t xml:space="preserve"> </w:t>
-      </w:r>
-      <w:r>
-        <w:rPr>
-          <w:color w:val="000000"/>
-        </w:rPr>
-        <w:t>MS SQL Server, MySQL, NoSQL, Elasticsearch</w:t>
+        </w:rPr>
+        <w:t xml:space="preserve">Database Systems: </w:t>
+      </w:r>
+      <w:r>
+        <w:t xml:space="preserve">MS SQL Server, </w:t>
+      </w:r>
+      <w:r>
+        <w:t>PostgreSQL</w:t>
+      </w:r>
+      <w:r>
+        <w:t>, NoSQL</w:t>
+      </w:r>
+      <w:r>
+        <w:t xml:space="preserve">, </w:t>
+      </w:r>
+      <w:r>
+        <w:t>Elasticsearch</w:t>
+      </w:r>
+      <w:r>
+        <w:t xml:space="preserve">, </w:t>
+      </w:r>
+      <w:r>
+        <w:t>Kafka, Apache Spark</w:t>
       </w:r>
     </w:p>
     <w:p>
-      <w:pPr>
-        <w:pBdr>
-          <w:top w:val="nil"/>
-          <w:left w:val="nil"/>
-          <w:bottom w:val="nil"/>
-          <w:right w:val="nil"/>
-          <w:between w:val="nil"/>
-        </w:pBdr>
-        <w:tabs>
-          <w:tab w:val="left" w:pos="5400"/>
-        </w:tabs>
-        <w:rPr>
-          <w:color w:val="000000"/>
-        </w:rPr>
-      </w:pPr>
       <w:r>
         <w:rPr>
           <w:b/>
-          <w:bCs/>
-          <w:color w:val="000000"/>
-        </w:rPr>
-        <w:t>Tools &amp; Platforms:</w:t>
-      </w:r>
-      <w:r>
-        <w:rPr>
-          <w:b/>
-          <w:bCs/>
-          <w:color w:val="000000"/>
-        </w:rPr>
-        <w:t xml:space="preserve"> </w:t>
-      </w:r>
-      <w:r>
-        <w:rPr>
-          <w:color w:val="000000"/>
-        </w:rPr>
-        <w:t>Git/GitHub, AWS, Docker, Kubernetes, Kafka</w:t>
+        </w:rPr>
+        <w:t xml:space="preserve">Cloud &amp; DevOps: </w:t>
+      </w:r>
+      <w:r>
+        <w:t>AWS, Docker, Kubernetes, Git/GitHub, CI/C</w:t>
+      </w:r>
+      <w:r>
+        <w:t>D Principles</w:t>
       </w:r>
     </w:p>
     <w:sectPr>
@@ -1495,6 +1243,458 @@
         </w:tabs>
         <w:ind w:left="6480" w:hanging="720"/>
       </w:pPr>
+    </w:lvl>
+  </w:abstractNum>
+  <w:abstractNum w:abstractNumId="2" w15:restartNumberingAfterBreak="0">
+    <w:nsid w:val="4B611EC7"/>
+    <w:multiLevelType w:val="hybridMultilevel"/>
+    <w:tmpl w:val="BF00E670"/>
+    <w:lvl w:ilvl="0" w:tplc="04090001">
+      <w:start w:val="1"/>
+      <w:numFmt w:val="bullet"/>
+      <w:lvlText w:val=""/>
+      <w:lvlJc w:val="left"/>
+      <w:pPr>
+        <w:ind w:left="1488" w:hanging="360"/>
+      </w:pPr>
+      <w:rPr>
+        <w:rFonts w:ascii="Symbol" w:hAnsi="Symbol" w:hint="default"/>
+      </w:rPr>
+    </w:lvl>
+    <w:lvl w:ilvl="1" w:tplc="04090003" w:tentative="1">
+      <w:start w:val="1"/>
+      <w:numFmt w:val="bullet"/>
+      <w:lvlText w:val="o"/>
+      <w:lvlJc w:val="left"/>
+      <w:pPr>
+        <w:ind w:left="2208" w:hanging="360"/>
+      </w:pPr>
+      <w:rPr>
+        <w:rFonts w:ascii="Courier New" w:hAnsi="Courier New" w:cs="Courier New" w:hint="default"/>
+      </w:rPr>
+    </w:lvl>
+    <w:lvl w:ilvl="2" w:tplc="04090005" w:tentative="1">
+      <w:start w:val="1"/>
+      <w:numFmt w:val="bullet"/>
+      <w:lvlText w:val=""/>
+      <w:lvlJc w:val="left"/>
+      <w:pPr>
+        <w:ind w:left="2928" w:hanging="360"/>
+      </w:pPr>
+      <w:rPr>
+        <w:rFonts w:ascii="Wingdings" w:hAnsi="Wingdings" w:hint="default"/>
+      </w:rPr>
+    </w:lvl>
+    <w:lvl w:ilvl="3" w:tplc="04090001" w:tentative="1">
+      <w:start w:val="1"/>
+      <w:numFmt w:val="bullet"/>
+      <w:lvlText w:val=""/>
+      <w:lvlJc w:val="left"/>
+      <w:pPr>
+        <w:ind w:left="3648" w:hanging="360"/>
+      </w:pPr>
+      <w:rPr>
+        <w:rFonts w:ascii="Symbol" w:hAnsi="Symbol" w:hint="default"/>
+      </w:rPr>
+    </w:lvl>
+    <w:lvl w:ilvl="4" w:tplc="04090003" w:tentative="1">
+      <w:start w:val="1"/>
+      <w:numFmt w:val="bullet"/>
+      <w:lvlText w:val="o"/>
+      <w:lvlJc w:val="left"/>
+      <w:pPr>
+        <w:ind w:left="4368" w:hanging="360"/>
+      </w:pPr>
+      <w:rPr>
+        <w:rFonts w:ascii="Courier New" w:hAnsi="Courier New" w:cs="Courier New" w:hint="default"/>
+      </w:rPr>
+    </w:lvl>
+    <w:lvl w:ilvl="5" w:tplc="04090005" w:tentative="1">
+      <w:start w:val="1"/>
+      <w:numFmt w:val="bullet"/>
+      <w:lvlText w:val=""/>
+      <w:lvlJc w:val="left"/>
+      <w:pPr>
+        <w:ind w:left="5088" w:hanging="360"/>
+      </w:pPr>
+      <w:rPr>
+        <w:rFonts w:ascii="Wingdings" w:hAnsi="Wingdings" w:hint="default"/>
+      </w:rPr>
+    </w:lvl>
+    <w:lvl w:ilvl="6" w:tplc="04090001" w:tentative="1">
+      <w:start w:val="1"/>
+      <w:numFmt w:val="bullet"/>
+      <w:lvlText w:val=""/>
+      <w:lvlJc w:val="left"/>
+      <w:pPr>
+        <w:ind w:left="5808" w:hanging="360"/>
+      </w:pPr>
+      <w:rPr>
+        <w:rFonts w:ascii="Symbol" w:hAnsi="Symbol" w:hint="default"/>
+      </w:rPr>
+    </w:lvl>
+    <w:lvl w:ilvl="7" w:tplc="04090003" w:tentative="1">
+      <w:start w:val="1"/>
+      <w:numFmt w:val="bullet"/>
+      <w:lvlText w:val="o"/>
+      <w:lvlJc w:val="left"/>
+      <w:pPr>
+        <w:ind w:left="6528" w:hanging="360"/>
+      </w:pPr>
+      <w:rPr>
+        <w:rFonts w:ascii="Courier New" w:hAnsi="Courier New" w:cs="Courier New" w:hint="default"/>
+      </w:rPr>
+    </w:lvl>
+    <w:lvl w:ilvl="8" w:tplc="04090005" w:tentative="1">
+      <w:start w:val="1"/>
+      <w:numFmt w:val="bullet"/>
+      <w:lvlText w:val=""/>
+      <w:lvlJc w:val="left"/>
+      <w:pPr>
+        <w:ind w:left="7248" w:hanging="360"/>
+      </w:pPr>
+      <w:rPr>
+        <w:rFonts w:ascii="Wingdings" w:hAnsi="Wingdings" w:hint="default"/>
+      </w:rPr>
+    </w:lvl>
+  </w:abstractNum>
+  <w:abstractNum w:abstractNumId="3" w15:restartNumberingAfterBreak="0">
+    <w:nsid w:val="67585D19"/>
+    <w:multiLevelType w:val="hybridMultilevel"/>
+    <w:tmpl w:val="8408B2A2"/>
+    <w:lvl w:ilvl="0" w:tplc="04090001">
+      <w:start w:val="1"/>
+      <w:numFmt w:val="bullet"/>
+      <w:lvlText w:val=""/>
+      <w:lvlJc w:val="left"/>
+      <w:pPr>
+        <w:ind w:left="720" w:hanging="360"/>
+      </w:pPr>
+      <w:rPr>
+        <w:rFonts w:ascii="Symbol" w:hAnsi="Symbol" w:hint="default"/>
+      </w:rPr>
+    </w:lvl>
+    <w:lvl w:ilvl="1" w:tplc="04090003" w:tentative="1">
+      <w:start w:val="1"/>
+      <w:numFmt w:val="bullet"/>
+      <w:lvlText w:val="o"/>
+      <w:lvlJc w:val="left"/>
+      <w:pPr>
+        <w:ind w:left="1440" w:hanging="360"/>
+      </w:pPr>
+      <w:rPr>
+        <w:rFonts w:ascii="Courier New" w:hAnsi="Courier New" w:cs="Courier New" w:hint="default"/>
+      </w:rPr>
+    </w:lvl>
+    <w:lvl w:ilvl="2" w:tplc="04090005" w:tentative="1">
+      <w:start w:val="1"/>
+      <w:numFmt w:val="bullet"/>
+      <w:lvlText w:val=""/>
+      <w:lvlJc w:val="left"/>
+      <w:pPr>
+        <w:ind w:left="2160" w:hanging="360"/>
+      </w:pPr>
+      <w:rPr>
+        <w:rFonts w:ascii="Wingdings" w:hAnsi="Wingdings" w:hint="default"/>
+      </w:rPr>
+    </w:lvl>
+    <w:lvl w:ilvl="3" w:tplc="04090001" w:tentative="1">
+      <w:start w:val="1"/>
+      <w:numFmt w:val="bullet"/>
+      <w:lvlText w:val=""/>
+      <w:lvlJc w:val="left"/>
+      <w:pPr>
+        <w:ind w:left="2880" w:hanging="360"/>
+      </w:pPr>
+      <w:rPr>
+        <w:rFonts w:ascii="Symbol" w:hAnsi="Symbol" w:hint="default"/>
+      </w:rPr>
+    </w:lvl>
+    <w:lvl w:ilvl="4" w:tplc="04090003" w:tentative="1">
+      <w:start w:val="1"/>
+      <w:numFmt w:val="bullet"/>
+      <w:lvlText w:val="o"/>
+      <w:lvlJc w:val="left"/>
+      <w:pPr>
+        <w:ind w:left="3600" w:hanging="360"/>
+      </w:pPr>
+      <w:rPr>
+        <w:rFonts w:ascii="Courier New" w:hAnsi="Courier New" w:cs="Courier New" w:hint="default"/>
+      </w:rPr>
+    </w:lvl>
+    <w:lvl w:ilvl="5" w:tplc="04090005" w:tentative="1">
+      <w:start w:val="1"/>
+      <w:numFmt w:val="bullet"/>
+      <w:lvlText w:val=""/>
+      <w:lvlJc w:val="left"/>
+      <w:pPr>
+        <w:ind w:left="4320" w:hanging="360"/>
+      </w:pPr>
+      <w:rPr>
+        <w:rFonts w:ascii="Wingdings" w:hAnsi="Wingdings" w:hint="default"/>
+      </w:rPr>
+    </w:lvl>
+    <w:lvl w:ilvl="6" w:tplc="04090001" w:tentative="1">
+      <w:start w:val="1"/>
+      <w:numFmt w:val="bullet"/>
+      <w:lvlText w:val=""/>
+      <w:lvlJc w:val="left"/>
+      <w:pPr>
+        <w:ind w:left="5040" w:hanging="360"/>
+      </w:pPr>
+      <w:rPr>
+        <w:rFonts w:ascii="Symbol" w:hAnsi="Symbol" w:hint="default"/>
+      </w:rPr>
+    </w:lvl>
+    <w:lvl w:ilvl="7" w:tplc="04090003" w:tentative="1">
+      <w:start w:val="1"/>
+      <w:numFmt w:val="bullet"/>
+      <w:lvlText w:val="o"/>
+      <w:lvlJc w:val="left"/>
+      <w:pPr>
+        <w:ind w:left="5760" w:hanging="360"/>
+      </w:pPr>
+      <w:rPr>
+        <w:rFonts w:ascii="Courier New" w:hAnsi="Courier New" w:cs="Courier New" w:hint="default"/>
+      </w:rPr>
+    </w:lvl>
+    <w:lvl w:ilvl="8" w:tplc="04090005" w:tentative="1">
+      <w:start w:val="1"/>
+      <w:numFmt w:val="bullet"/>
+      <w:lvlText w:val=""/>
+      <w:lvlJc w:val="left"/>
+      <w:pPr>
+        <w:ind w:left="6480" w:hanging="360"/>
+      </w:pPr>
+      <w:rPr>
+        <w:rFonts w:ascii="Wingdings" w:hAnsi="Wingdings" w:hint="default"/>
+      </w:rPr>
+    </w:lvl>
+  </w:abstractNum>
+  <w:abstractNum w:abstractNumId="4" w15:restartNumberingAfterBreak="0">
+    <w:nsid w:val="73304CE3"/>
+    <w:multiLevelType w:val="hybridMultilevel"/>
+    <w:tmpl w:val="5E22CE40"/>
+    <w:lvl w:ilvl="0" w:tplc="04090001">
+      <w:start w:val="1"/>
+      <w:numFmt w:val="bullet"/>
+      <w:lvlText w:val=""/>
+      <w:lvlJc w:val="left"/>
+      <w:pPr>
+        <w:ind w:left="720" w:hanging="360"/>
+      </w:pPr>
+      <w:rPr>
+        <w:rFonts w:ascii="Symbol" w:hAnsi="Symbol" w:hint="default"/>
+      </w:rPr>
+    </w:lvl>
+    <w:lvl w:ilvl="1" w:tplc="04090003" w:tentative="1">
+      <w:start w:val="1"/>
+      <w:numFmt w:val="bullet"/>
+      <w:lvlText w:val="o"/>
+      <w:lvlJc w:val="left"/>
+      <w:pPr>
+        <w:ind w:left="1440" w:hanging="360"/>
+      </w:pPr>
+      <w:rPr>
+        <w:rFonts w:ascii="Courier New" w:hAnsi="Courier New" w:cs="Courier New" w:hint="default"/>
+      </w:rPr>
+    </w:lvl>
+    <w:lvl w:ilvl="2" w:tplc="04090005" w:tentative="1">
+      <w:start w:val="1"/>
+      <w:numFmt w:val="bullet"/>
+      <w:lvlText w:val=""/>
+      <w:lvlJc w:val="left"/>
+      <w:pPr>
+        <w:ind w:left="2160" w:hanging="360"/>
+      </w:pPr>
+      <w:rPr>
+        <w:rFonts w:ascii="Wingdings" w:hAnsi="Wingdings" w:hint="default"/>
+      </w:rPr>
+    </w:lvl>
+    <w:lvl w:ilvl="3" w:tplc="04090001" w:tentative="1">
+      <w:start w:val="1"/>
+      <w:numFmt w:val="bullet"/>
+      <w:lvlText w:val=""/>
+      <w:lvlJc w:val="left"/>
+      <w:pPr>
+        <w:ind w:left="2880" w:hanging="360"/>
+      </w:pPr>
+      <w:rPr>
+        <w:rFonts w:ascii="Symbol" w:hAnsi="Symbol" w:hint="default"/>
+      </w:rPr>
+    </w:lvl>
+    <w:lvl w:ilvl="4" w:tplc="04090003" w:tentative="1">
+      <w:start w:val="1"/>
+      <w:numFmt w:val="bullet"/>
+      <w:lvlText w:val="o"/>
+      <w:lvlJc w:val="left"/>
+      <w:pPr>
+        <w:ind w:left="3600" w:hanging="360"/>
+      </w:pPr>
+      <w:rPr>
+        <w:rFonts w:ascii="Courier New" w:hAnsi="Courier New" w:cs="Courier New" w:hint="default"/>
+      </w:rPr>
+    </w:lvl>
+    <w:lvl w:ilvl="5" w:tplc="04090005" w:tentative="1">
+      <w:start w:val="1"/>
+      <w:numFmt w:val="bullet"/>
+      <w:lvlText w:val=""/>
+      <w:lvlJc w:val="left"/>
+      <w:pPr>
+        <w:ind w:left="4320" w:hanging="360"/>
+      </w:pPr>
+      <w:rPr>
+        <w:rFonts w:ascii="Wingdings" w:hAnsi="Wingdings" w:hint="default"/>
+      </w:rPr>
+    </w:lvl>
+    <w:lvl w:ilvl="6" w:tplc="04090001" w:tentative="1">
+      <w:start w:val="1"/>
+      <w:numFmt w:val="bullet"/>
+      <w:lvlText w:val=""/>
+      <w:lvlJc w:val="left"/>
+      <w:pPr>
+        <w:ind w:left="5040" w:hanging="360"/>
+      </w:pPr>
+      <w:rPr>
+        <w:rFonts w:ascii="Symbol" w:hAnsi="Symbol" w:hint="default"/>
+      </w:rPr>
+    </w:lvl>
+    <w:lvl w:ilvl="7" w:tplc="04090003" w:tentative="1">
+      <w:start w:val="1"/>
+      <w:numFmt w:val="bullet"/>
+      <w:lvlText w:val="o"/>
+      <w:lvlJc w:val="left"/>
+      <w:pPr>
+        <w:ind w:left="5760" w:hanging="360"/>
+      </w:pPr>
+      <w:rPr>
+        <w:rFonts w:ascii="Courier New" w:hAnsi="Courier New" w:cs="Courier New" w:hint="default"/>
+      </w:rPr>
+    </w:lvl>
+    <w:lvl w:ilvl="8" w:tplc="04090005" w:tentative="1">
+      <w:start w:val="1"/>
+      <w:numFmt w:val="bullet"/>
+      <w:lvlText w:val=""/>
+      <w:lvlJc w:val="left"/>
+      <w:pPr>
+        <w:ind w:left="6480" w:hanging="360"/>
+      </w:pPr>
+      <w:rPr>
+        <w:rFonts w:ascii="Wingdings" w:hAnsi="Wingdings" w:hint="default"/>
+      </w:rPr>
+    </w:lvl>
+  </w:abstractNum>
+  <w:abstractNum w:abstractNumId="5" w15:restartNumberingAfterBreak="0">
+    <w:nsid w:val="7EDC0620"/>
+    <w:multiLevelType w:val="hybridMultilevel"/>
+    <w:tmpl w:val="54A0F62E"/>
+    <w:lvl w:ilvl="0" w:tplc="04090001">
+      <w:start w:val="1"/>
+      <w:numFmt w:val="bullet"/>
+      <w:lvlText w:val=""/>
+      <w:lvlJc w:val="left"/>
+      <w:pPr>
+        <w:ind w:left="720" w:hanging="360"/>
+      </w:pPr>
+      <w:rPr>
+        <w:rFonts w:ascii="Symbol" w:hAnsi="Symbol" w:hint="default"/>
+      </w:rPr>
+    </w:lvl>
+    <w:lvl w:ilvl="1" w:tplc="04090003" w:tentative="1">
+      <w:start w:val="1"/>
+      <w:numFmt w:val="bullet"/>
+      <w:lvlText w:val="o"/>
+      <w:lvlJc w:val="left"/>
+      <w:pPr>
+        <w:ind w:left="1440" w:hanging="360"/>
+      </w:pPr>
+      <w:rPr>
+        <w:rFonts w:ascii="Courier New" w:hAnsi="Courier New" w:cs="Courier New" w:hint="default"/>
+      </w:rPr>
+    </w:lvl>
+    <w:lvl w:ilvl="2" w:tplc="04090005" w:tentative="1">
+      <w:start w:val="1"/>
+      <w:numFmt w:val="bullet"/>
+      <w:lvlText w:val=""/>
+      <w:lvlJc w:val="left"/>
+      <w:pPr>
+        <w:ind w:left="2160" w:hanging="360"/>
+      </w:pPr>
+      <w:rPr>
+        <w:rFonts w:ascii="Wingdings" w:hAnsi="Wingdings" w:hint="default"/>
+      </w:rPr>
+    </w:lvl>
+    <w:lvl w:ilvl="3" w:tplc="04090001" w:tentative="1">
+      <w:start w:val="1"/>
+      <w:numFmt w:val="bullet"/>
+      <w:lvlText w:val=""/>
+      <w:lvlJc w:val="left"/>
+      <w:pPr>
+        <w:ind w:left="2880" w:hanging="360"/>
+      </w:pPr>
+      <w:rPr>
+        <w:rFonts w:ascii="Symbol" w:hAnsi="Symbol" w:hint="default"/>
+      </w:rPr>
+    </w:lvl>
+    <w:lvl w:ilvl="4" w:tplc="04090003" w:tentative="1">
+      <w:start w:val="1"/>
+      <w:numFmt w:val="bullet"/>
+      <w:lvlText w:val="o"/>
+      <w:lvlJc w:val="left"/>
+      <w:pPr>
+        <w:ind w:left="3600" w:hanging="360"/>
+      </w:pPr>
+      <w:rPr>
+        <w:rFonts w:ascii="Courier New" w:hAnsi="Courier New" w:cs="Courier New" w:hint="default"/>
+      </w:rPr>
+    </w:lvl>
+    <w:lvl w:ilvl="5" w:tplc="04090005" w:tentative="1">
+      <w:start w:val="1"/>
+      <w:numFmt w:val="bullet"/>
+      <w:lvlText w:val=""/>
+      <w:lvlJc w:val="left"/>
+      <w:pPr>
+        <w:ind w:left="4320" w:hanging="360"/>
+      </w:pPr>
+      <w:rPr>
+        <w:rFonts w:ascii="Wingdings" w:hAnsi="Wingdings" w:hint="default"/>
+      </w:rPr>
+    </w:lvl>
+    <w:lvl w:ilvl="6" w:tplc="04090001" w:tentative="1">
+      <w:start w:val="1"/>
+      <w:numFmt w:val="bullet"/>
+      <w:lvlText w:val=""/>
+      <w:lvlJc w:val="left"/>
+      <w:pPr>
+        <w:ind w:left="5040" w:hanging="360"/>
+      </w:pPr>
+      <w:rPr>
+        <w:rFonts w:ascii="Symbol" w:hAnsi="Symbol" w:hint="default"/>
+      </w:rPr>
+    </w:lvl>
+    <w:lvl w:ilvl="7" w:tplc="04090003" w:tentative="1">
+      <w:start w:val="1"/>
+      <w:numFmt w:val="bullet"/>
+      <w:lvlText w:val="o"/>
+      <w:lvlJc w:val="left"/>
+      <w:pPr>
+        <w:ind w:left="5760" w:hanging="360"/>
+      </w:pPr>
+      <w:rPr>
+        <w:rFonts w:ascii="Courier New" w:hAnsi="Courier New" w:cs="Courier New" w:hint="default"/>
+      </w:rPr>
+    </w:lvl>
+    <w:lvl w:ilvl="8" w:tplc="04090005" w:tentative="1">
+      <w:start w:val="1"/>
+      <w:numFmt w:val="bullet"/>
+      <w:lvlText w:val=""/>
+      <w:lvlJc w:val="left"/>
+      <w:pPr>
+        <w:ind w:left="6480" w:hanging="360"/>
+      </w:pPr>
+      <w:rPr>
+        <w:rFonts w:ascii="Wingdings" w:hAnsi="Wingdings" w:hint="default"/>
+      </w:rPr>
     </w:lvl>
   </w:abstractNum>
   <w:num w:numId="1">
@@ -1532,6 +1732,18 @@
     <w:lvlOverride w:ilvl="8">
       <w:startOverride w:val="1"/>
     </w:lvlOverride>
+  </w:num>
+  <w:num w:numId="4">
+    <w:abstractNumId w:val="4"/>
+  </w:num>
+  <w:num w:numId="5">
+    <w:abstractNumId w:val="5"/>
+  </w:num>
+  <w:num w:numId="6">
+    <w:abstractNumId w:val="2"/>
+  </w:num>
+  <w:num w:numId="7">
+    <w:abstractNumId w:val="3"/>
   </w:num>
 </w:numbering>
 </file>
@@ -2790,6 +3002,10 @@
 </go:gDocsCustomXmlDataStorage>
 </file>
 
+<file path=customXml/item2.xml><?xml version="1.0" encoding="utf-8"?>
+<b:Sources xmlns:b="http://schemas.openxmlformats.org/officeDocument/2006/bibliography" xmlns="http://schemas.openxmlformats.org/officeDocument/2006/bibliography" SelectedStyle="\APASixthEditionOfficeOnline.xsl" StyleName="APA" Version="6"/>
+</file>
+
 <file path=customXml/itemProps1.xml><?xml version="1.0" encoding="utf-8"?>
 <ds:datastoreItem xmlns:ds="http://schemas.openxmlformats.org/officeDocument/2006/customXml" ds:itemID="{11111111-1234-1234-1234-123412341234}">
   <ds:schemaRefs>
@@ -2797,4 +3013,12 @@
     <ds:schemaRef ds:uri="http://schemas.openxmlformats.org/officeDocument/2006/relationships"/>
   </ds:schemaRefs>
 </ds:datastoreItem>
+</file>
+
+<file path=customXml/itemProps2.xml><?xml version="1.0" encoding="utf-8"?>
+<ds:datastoreItem xmlns:ds="http://schemas.openxmlformats.org/officeDocument/2006/customXml" ds:itemID="{BD82004B-6683-410F-8D5D-93307B7382CF}">
+  <ds:schemaRefs>
+    <ds:schemaRef ds:uri="http://schemas.openxmlformats.org/officeDocument/2006/bibliography"/>
+  </ds:schemaRefs>
+</ds:datastoreItem>
 </file>
</xml_diff>